<commit_message>
Se corrige las plantillas de word para la contratacion
</commit_message>
<xml_diff>
--- a/back/src/static/todoSilver/AcuerdoConfidencialdiadCapital.docx
+++ b/back/src/static/todoSilver/AcuerdoConfidencialdiadCapital.docx
@@ -1,6 +1,6 @@
 
 <file path=word/document.xml><?xml version="1.0" encoding="utf-8"?>
-<w:document xmlns:wpc="http://schemas.microsoft.com/office/word/2010/wordprocessingCanvas" xmlns:cx="http://schemas.microsoft.com/office/drawing/2014/chartex" xmlns:cx1="http://schemas.microsoft.com/office/drawing/2015/9/8/chartex" xmlns:cx2="http://schemas.microsoft.com/office/drawing/2015/10/21/chartex" xmlns:cx3="http://schemas.microsoft.com/office/drawing/2016/5/9/chartex" xmlns:cx4="http://schemas.microsoft.com/office/drawing/2016/5/10/chartex" xmlns:cx5="http://schemas.microsoft.com/office/drawing/2016/5/11/chartex" xmlns:cx6="http://schemas.microsoft.com/office/drawing/2016/5/12/chartex" xmlns:cx7="http://schemas.microsoft.com/office/drawing/2016/5/13/chartex" xmlns:cx8="http://schemas.microsoft.com/office/drawing/2016/5/14/chartex" xmlns:mc="http://schemas.openxmlformats.org/markup-compatibility/2006" xmlns:aink="http://schemas.microsoft.com/office/drawing/2016/ink" xmlns:am3d="http://schemas.microsoft.com/office/drawing/2017/model3d" xmlns:o="urn:schemas-microsoft-com:office:office" xmlns:oel="http://schemas.microsoft.com/office/2019/extlst" xmlns:r="http://schemas.openxmlformats.org/officeDocument/2006/relationships" xmlns:m="http://schemas.openxmlformats.org/officeDocument/2006/math" xmlns:v="urn:schemas-microsoft-com:vml" xmlns:wp14="http://schemas.microsoft.com/office/word/2010/wordprocessingDrawing" xmlns:wp="http://schemas.openxmlformats.org/drawingml/2006/wordprocessingDrawing" xmlns:w10="urn:schemas-microsoft-com:office:word" xmlns:w="http://schemas.openxmlformats.org/wordprocessingml/2006/main" xmlns:w14="http://schemas.microsoft.com/office/word/2010/wordml" xmlns:w15="http://schemas.microsoft.com/office/word/2012/wordml" xmlns:w16cex="http://schemas.microsoft.com/office/word/2018/wordml/cex" xmlns:w16cid="http://schemas.microsoft.com/office/word/2016/wordml/cid" xmlns:w16="http://schemas.microsoft.com/office/word/2018/wordml" xmlns:w16du="http://schemas.microsoft.com/office/word/2023/wordml/word16du" xmlns:w16sdtdh="http://schemas.microsoft.com/office/word/2020/wordml/sdtdatahash" xmlns:w16sdtfl="http://schemas.microsoft.com/office/word/2024/wordml/sdtformatlock" xmlns:w16se="http://schemas.microsoft.com/office/word/2015/wordml/symex" xmlns:wpg="http://schemas.microsoft.com/office/word/2010/wordprocessingGroup" xmlns:wpi="http://schemas.microsoft.com/office/word/2010/wordprocessingInk" xmlns:wne="http://schemas.microsoft.com/office/word/2006/wordml" xmlns:wps="http://schemas.microsoft.com/office/word/2010/wordprocessingShape" mc:Ignorable="w14 w15 w16se w16cid w16 w16cex w16sdtdh w16sdtfl w16du wp14">
+<w:document xmlns:wpc="http://schemas.microsoft.com/office/word/2010/wordprocessingCanvas" xmlns:cx="http://schemas.microsoft.com/office/drawing/2014/chartex" xmlns:cx1="http://schemas.microsoft.com/office/drawing/2015/9/8/chartex" xmlns:cx2="http://schemas.microsoft.com/office/drawing/2015/10/21/chartex" xmlns:cx3="http://schemas.microsoft.com/office/drawing/2016/5/9/chartex" xmlns:cx4="http://schemas.microsoft.com/office/drawing/2016/5/10/chartex" xmlns:cx5="http://schemas.microsoft.com/office/drawing/2016/5/11/chartex" xmlns:cx6="http://schemas.microsoft.com/office/drawing/2016/5/12/chartex" xmlns:cx7="http://schemas.microsoft.com/office/drawing/2016/5/13/chartex" xmlns:cx8="http://schemas.microsoft.com/office/drawing/2016/5/14/chartex" xmlns:mc="http://schemas.openxmlformats.org/markup-compatibility/2006" xmlns:aink="http://schemas.microsoft.com/office/drawing/2016/ink" xmlns:am3d="http://schemas.microsoft.com/office/drawing/2017/model3d" xmlns:o="urn:schemas-microsoft-com:office:office" xmlns:oel="http://schemas.microsoft.com/office/2019/extlst" xmlns:r="http://schemas.openxmlformats.org/officeDocument/2006/relationships" xmlns:m="http://schemas.openxmlformats.org/officeDocument/2006/math" xmlns:v="urn:schemas-microsoft-com:vml" xmlns:wp14="http://schemas.microsoft.com/office/word/2010/wordprocessingDrawing" xmlns:wp="http://schemas.openxmlformats.org/drawingml/2006/wordprocessingDrawing" xmlns:w10="urn:schemas-microsoft-com:office:word" xmlns:w="http://schemas.openxmlformats.org/wordprocessingml/2006/main" xmlns:w14="http://schemas.microsoft.com/office/word/2010/wordml" xmlns:w15="http://schemas.microsoft.com/office/word/2012/wordml" xmlns:w16cei="http://schemas.microsoft.com/office/word/2026/wordml/cei" xmlns:w16cex="http://schemas.microsoft.com/office/word/2018/wordml/cex" xmlns:w16cid="http://schemas.microsoft.com/office/word/2016/wordml/cid" xmlns:w16="http://schemas.microsoft.com/office/word/2018/wordml" xmlns:w16du="http://schemas.microsoft.com/office/word/2023/wordml/word16du" xmlns:w16sdtdh="http://schemas.microsoft.com/office/word/2020/wordml/sdtdatahash" xmlns:w16sdtfl="http://schemas.microsoft.com/office/word/2024/wordml/sdtformatlock" xmlns:w16se="http://schemas.microsoft.com/office/word/2015/wordml/symex" xmlns:wpg="http://schemas.microsoft.com/office/word/2010/wordprocessingGroup" xmlns:wpi="http://schemas.microsoft.com/office/word/2010/wordprocessingInk" xmlns:wne="http://schemas.microsoft.com/office/word/2006/wordml" xmlns:wps="http://schemas.microsoft.com/office/word/2010/wordprocessingShape" mc:Ignorable="w14 w15 w16se w16cid w16 w16cex w16sdtdh w16sdtfl w16du wp14">
   <w:body>
     <w:p>
       <w:pPr>
@@ -2427,14 +2427,30 @@
           <w:rFonts w:ascii="Century Gothic" w:hAnsi="Century Gothic"/>
           <w:b/>
         </w:rPr>
-        <w:t xml:space="preserve"> - </w:t>
-      </w:r>
+        <w:t xml:space="preserve"> </w:t>
+      </w:r>
+      <w:proofErr w:type="gramStart"/>
       <w:r>
         <w:rPr>
           <w:rFonts w:ascii="Century Gothic" w:hAnsi="Century Gothic"/>
           <w:b/>
         </w:rPr>
-        <w:t xml:space="preserve"> REQUERIMIENTOS POR AUTORIDADES JUDICIALES O ADMINISTRATIVAS.</w:t>
+        <w:t xml:space="preserve">- </w:t>
+      </w:r>
+      <w:r>
+        <w:rPr>
+          <w:rFonts w:ascii="Century Gothic" w:hAnsi="Century Gothic"/>
+          <w:b/>
+        </w:rPr>
+        <w:t xml:space="preserve"> REQUERIMIENTOS</w:t>
+      </w:r>
+      <w:proofErr w:type="gramEnd"/>
+      <w:r>
+        <w:rPr>
+          <w:rFonts w:ascii="Century Gothic" w:hAnsi="Century Gothic"/>
+          <w:b/>
+        </w:rPr>
+        <w:t xml:space="preserve"> POR AUTORIDADES JUDICIALES O ADMINISTRATIVAS.</w:t>
       </w:r>
       <w:r>
         <w:rPr>
@@ -3221,7 +3237,7 @@
                 <w:sz w:val="22"/>
                 <w:szCs w:val="22"/>
               </w:rPr>
-              <w:t xml:space="preserve">}} </w:t>
+              <w:t>}}</w:t>
             </w:r>
           </w:p>
           <w:p>
@@ -3242,7 +3258,7 @@
                 <w:sz w:val="22"/>
                 <w:szCs w:val="22"/>
               </w:rPr>
-              <w:t>C.C. {{</w:t>
+              <w:t>{{</w:t>
             </w:r>
             <w:proofErr w:type="spellStart"/>
             <w:r>
@@ -3262,7 +3278,7 @@
                 <w:sz w:val="22"/>
                 <w:szCs w:val="22"/>
               </w:rPr>
-              <w:t xml:space="preserve">}} </w:t>
+              <w:t>}}</w:t>
             </w:r>
           </w:p>
           <w:p>
@@ -3283,27 +3299,7 @@
                 <w:sz w:val="22"/>
                 <w:szCs w:val="22"/>
               </w:rPr>
-              <w:t>{{</w:t>
-            </w:r>
-            <w:proofErr w:type="spellStart"/>
-            <w:r>
-              <w:rPr>
-                <w:rFonts w:ascii="Century Gothic" w:hAnsi="Century Gothic" w:cs="Arial"/>
-                <w:b/>
-                <w:sz w:val="22"/>
-                <w:szCs w:val="22"/>
-              </w:rPr>
-              <w:t>ContratistaFirmaCargo</w:t>
-            </w:r>
-            <w:proofErr w:type="spellEnd"/>
-            <w:r>
-              <w:rPr>
-                <w:rFonts w:ascii="Century Gothic" w:hAnsi="Century Gothic" w:cs="Arial"/>
-                <w:b/>
-                <w:sz w:val="22"/>
-                <w:szCs w:val="22"/>
-              </w:rPr>
-              <w:t xml:space="preserve">}} </w:t>
+              <w:t>{{#ContratistaFirmaNit}}</w:t>
             </w:r>
           </w:p>
           <w:p>
@@ -3324,7 +3320,7 @@
                 <w:sz w:val="22"/>
                 <w:szCs w:val="22"/>
               </w:rPr>
-              <w:t>NIT. {{</w:t>
+              <w:t>{{</w:t>
             </w:r>
             <w:proofErr w:type="spellStart"/>
             <w:r>
@@ -3334,7 +3330,7 @@
                 <w:sz w:val="22"/>
                 <w:szCs w:val="22"/>
               </w:rPr>
-              <w:t>ContratistaFirmaNit</w:t>
+              <w:t>ContratistaFirmaCargo</w:t>
             </w:r>
             <w:proofErr w:type="spellEnd"/>
             <w:r>
@@ -3350,6 +3346,88 @@
           <w:p>
             <w:pPr>
               <w:spacing w:line="276" w:lineRule="auto"/>
+              <w:jc w:val="both"/>
+              <w:rPr>
+                <w:rFonts w:ascii="Century Gothic" w:hAnsi="Century Gothic" w:cs="Arial"/>
+                <w:b/>
+                <w:sz w:val="22"/>
+                <w:szCs w:val="22"/>
+              </w:rPr>
+            </w:pPr>
+            <w:r>
+              <w:rPr>
+                <w:rFonts w:ascii="Century Gothic" w:hAnsi="Century Gothic" w:cs="Arial"/>
+                <w:b/>
+                <w:sz w:val="22"/>
+                <w:szCs w:val="22"/>
+              </w:rPr>
+              <w:t>NIT. {{</w:t>
+            </w:r>
+            <w:proofErr w:type="spellStart"/>
+            <w:r>
+              <w:rPr>
+                <w:rFonts w:ascii="Century Gothic" w:hAnsi="Century Gothic" w:cs="Arial"/>
+                <w:b/>
+                <w:sz w:val="22"/>
+                <w:szCs w:val="22"/>
+              </w:rPr>
+              <w:t>ContratistaFirmaNit</w:t>
+            </w:r>
+            <w:proofErr w:type="spellEnd"/>
+            <w:r>
+              <w:rPr>
+                <w:rFonts w:ascii="Century Gothic" w:hAnsi="Century Gothic" w:cs="Arial"/>
+                <w:b/>
+                <w:sz w:val="22"/>
+                <w:szCs w:val="22"/>
+              </w:rPr>
+              <w:t>}}</w:t>
+            </w:r>
+          </w:p>
+          <w:p>
+            <w:pPr>
+              <w:spacing w:line="276" w:lineRule="auto"/>
+              <w:jc w:val="both"/>
+              <w:rPr>
+                <w:rFonts w:ascii="Century Gothic" w:hAnsi="Century Gothic" w:cs="Arial"/>
+                <w:b/>
+                <w:sz w:val="22"/>
+                <w:szCs w:val="22"/>
+              </w:rPr>
+            </w:pPr>
+            <w:r>
+              <w:rPr>
+                <w:rFonts w:ascii="Century Gothic" w:hAnsi="Century Gothic" w:cs="Arial"/>
+                <w:b/>
+                <w:sz w:val="22"/>
+                <w:szCs w:val="22"/>
+              </w:rPr>
+              <w:t>{{/</w:t>
+            </w:r>
+            <w:proofErr w:type="spellStart"/>
+            <w:r>
+              <w:rPr>
+                <w:rFonts w:ascii="Century Gothic" w:hAnsi="Century Gothic" w:cs="Arial"/>
+                <w:b/>
+                <w:sz w:val="22"/>
+                <w:szCs w:val="22"/>
+              </w:rPr>
+              <w:t>ContratistaFirmaNit</w:t>
+            </w:r>
+            <w:proofErr w:type="spellEnd"/>
+            <w:r>
+              <w:rPr>
+                <w:rFonts w:ascii="Century Gothic" w:hAnsi="Century Gothic" w:cs="Arial"/>
+                <w:b/>
+                <w:sz w:val="22"/>
+                <w:szCs w:val="22"/>
+              </w:rPr>
+              <w:t>}}</w:t>
+            </w:r>
+          </w:p>
+          <w:p>
+            <w:pPr>
+              <w:spacing w:line="276" w:lineRule="auto"/>
               <w:rPr>
                 <w:rFonts w:ascii="Century Gothic" w:hAnsi="Century Gothic"/>
                 <w:b/>
@@ -3367,6 +3445,7 @@
         <w:jc w:val="both"/>
         <w:rPr>
           <w:rFonts w:ascii="Century Gothic" w:hAnsi="Century Gothic" w:cs="Segoe UI"/>
+          <w:u w:val="single"/>
         </w:rPr>
       </w:pPr>
     </w:p>
@@ -3386,7 +3465,7 @@
 </file>
 
 <file path=word/endnotes.xml><?xml version="1.0" encoding="utf-8"?>
-<w:endnotes xmlns:wpc="http://schemas.microsoft.com/office/word/2010/wordprocessingCanvas" xmlns:cx="http://schemas.microsoft.com/office/drawing/2014/chartex" xmlns:cx1="http://schemas.microsoft.com/office/drawing/2015/9/8/chartex" xmlns:cx2="http://schemas.microsoft.com/office/drawing/2015/10/21/chartex" xmlns:cx3="http://schemas.microsoft.com/office/drawing/2016/5/9/chartex" xmlns:cx4="http://schemas.microsoft.com/office/drawing/2016/5/10/chartex" xmlns:cx5="http://schemas.microsoft.com/office/drawing/2016/5/11/chartex" xmlns:cx6="http://schemas.microsoft.com/office/drawing/2016/5/12/chartex" xmlns:cx7="http://schemas.microsoft.com/office/drawing/2016/5/13/chartex" xmlns:cx8="http://schemas.microsoft.com/office/drawing/2016/5/14/chartex" xmlns:mc="http://schemas.openxmlformats.org/markup-compatibility/2006" xmlns:aink="http://schemas.microsoft.com/office/drawing/2016/ink" xmlns:am3d="http://schemas.microsoft.com/office/drawing/2017/model3d" xmlns:o="urn:schemas-microsoft-com:office:office" xmlns:oel="http://schemas.microsoft.com/office/2019/extlst" xmlns:r="http://schemas.openxmlformats.org/officeDocument/2006/relationships" xmlns:m="http://schemas.openxmlformats.org/officeDocument/2006/math" xmlns:v="urn:schemas-microsoft-com:vml" xmlns:wp14="http://schemas.microsoft.com/office/word/2010/wordprocessingDrawing" xmlns:wp="http://schemas.openxmlformats.org/drawingml/2006/wordprocessingDrawing" xmlns:w10="urn:schemas-microsoft-com:office:word" xmlns:w="http://schemas.openxmlformats.org/wordprocessingml/2006/main" xmlns:w14="http://schemas.microsoft.com/office/word/2010/wordml" xmlns:w15="http://schemas.microsoft.com/office/word/2012/wordml" xmlns:w16cex="http://schemas.microsoft.com/office/word/2018/wordml/cex" xmlns:w16cid="http://schemas.microsoft.com/office/word/2016/wordml/cid" xmlns:w16="http://schemas.microsoft.com/office/word/2018/wordml" xmlns:w16du="http://schemas.microsoft.com/office/word/2023/wordml/word16du" xmlns:w16sdtdh="http://schemas.microsoft.com/office/word/2020/wordml/sdtdatahash" xmlns:w16sdtfl="http://schemas.microsoft.com/office/word/2024/wordml/sdtformatlock" xmlns:w16se="http://schemas.microsoft.com/office/word/2015/wordml/symex" xmlns:wpg="http://schemas.microsoft.com/office/word/2010/wordprocessingGroup" xmlns:wpi="http://schemas.microsoft.com/office/word/2010/wordprocessingInk" xmlns:wne="http://schemas.microsoft.com/office/word/2006/wordml" xmlns:wps="http://schemas.microsoft.com/office/word/2010/wordprocessingShape" mc:Ignorable="w14 w15 w16se w16cid w16 w16cex w16sdtdh w16sdtfl w16du wp14">
+<w:endnotes xmlns:wpc="http://schemas.microsoft.com/office/word/2010/wordprocessingCanvas" xmlns:cx="http://schemas.microsoft.com/office/drawing/2014/chartex" xmlns:cx1="http://schemas.microsoft.com/office/drawing/2015/9/8/chartex" xmlns:cx2="http://schemas.microsoft.com/office/drawing/2015/10/21/chartex" xmlns:cx3="http://schemas.microsoft.com/office/drawing/2016/5/9/chartex" xmlns:cx4="http://schemas.microsoft.com/office/drawing/2016/5/10/chartex" xmlns:cx5="http://schemas.microsoft.com/office/drawing/2016/5/11/chartex" xmlns:cx6="http://schemas.microsoft.com/office/drawing/2016/5/12/chartex" xmlns:cx7="http://schemas.microsoft.com/office/drawing/2016/5/13/chartex" xmlns:cx8="http://schemas.microsoft.com/office/drawing/2016/5/14/chartex" xmlns:mc="http://schemas.openxmlformats.org/markup-compatibility/2006" xmlns:aink="http://schemas.microsoft.com/office/drawing/2016/ink" xmlns:am3d="http://schemas.microsoft.com/office/drawing/2017/model3d" xmlns:o="urn:schemas-microsoft-com:office:office" xmlns:oel="http://schemas.microsoft.com/office/2019/extlst" xmlns:r="http://schemas.openxmlformats.org/officeDocument/2006/relationships" xmlns:m="http://schemas.openxmlformats.org/officeDocument/2006/math" xmlns:v="urn:schemas-microsoft-com:vml" xmlns:wp14="http://schemas.microsoft.com/office/word/2010/wordprocessingDrawing" xmlns:wp="http://schemas.openxmlformats.org/drawingml/2006/wordprocessingDrawing" xmlns:w10="urn:schemas-microsoft-com:office:word" xmlns:w="http://schemas.openxmlformats.org/wordprocessingml/2006/main" xmlns:w14="http://schemas.microsoft.com/office/word/2010/wordml" xmlns:w15="http://schemas.microsoft.com/office/word/2012/wordml" xmlns:w16cei="http://schemas.microsoft.com/office/word/2026/wordml/cei" xmlns:w16cex="http://schemas.microsoft.com/office/word/2018/wordml/cex" xmlns:w16cid="http://schemas.microsoft.com/office/word/2016/wordml/cid" xmlns:w16="http://schemas.microsoft.com/office/word/2018/wordml" xmlns:w16du="http://schemas.microsoft.com/office/word/2023/wordml/word16du" xmlns:w16sdtdh="http://schemas.microsoft.com/office/word/2020/wordml/sdtdatahash" xmlns:w16sdtfl="http://schemas.microsoft.com/office/word/2024/wordml/sdtformatlock" xmlns:w16se="http://schemas.microsoft.com/office/word/2015/wordml/symex" xmlns:wpg="http://schemas.microsoft.com/office/word/2010/wordprocessingGroup" xmlns:wpi="http://schemas.microsoft.com/office/word/2010/wordprocessingInk" xmlns:wne="http://schemas.microsoft.com/office/word/2006/wordml" xmlns:wps="http://schemas.microsoft.com/office/word/2010/wordprocessingShape" mc:Ignorable="w14 w15 w16se w16cid w16 w16cex w16sdtdh w16sdtfl w16du wp14">
   <w:endnote w:type="separator" w:id="-1">
     <w:p>
       <w:pPr>
@@ -3418,7 +3497,7 @@
 </file>
 
 <file path=word/footer1.xml><?xml version="1.0" encoding="utf-8"?>
-<w:ftr xmlns:wpc="http://schemas.microsoft.com/office/word/2010/wordprocessingCanvas" xmlns:cx="http://schemas.microsoft.com/office/drawing/2014/chartex" xmlns:cx1="http://schemas.microsoft.com/office/drawing/2015/9/8/chartex" xmlns:cx2="http://schemas.microsoft.com/office/drawing/2015/10/21/chartex" xmlns:cx3="http://schemas.microsoft.com/office/drawing/2016/5/9/chartex" xmlns:cx4="http://schemas.microsoft.com/office/drawing/2016/5/10/chartex" xmlns:cx5="http://schemas.microsoft.com/office/drawing/2016/5/11/chartex" xmlns:cx6="http://schemas.microsoft.com/office/drawing/2016/5/12/chartex" xmlns:cx7="http://schemas.microsoft.com/office/drawing/2016/5/13/chartex" xmlns:cx8="http://schemas.microsoft.com/office/drawing/2016/5/14/chartex" xmlns:mc="http://schemas.openxmlformats.org/markup-compatibility/2006" xmlns:aink="http://schemas.microsoft.com/office/drawing/2016/ink" xmlns:am3d="http://schemas.microsoft.com/office/drawing/2017/model3d" xmlns:o="urn:schemas-microsoft-com:office:office" xmlns:oel="http://schemas.microsoft.com/office/2019/extlst" xmlns:r="http://schemas.openxmlformats.org/officeDocument/2006/relationships" xmlns:m="http://schemas.openxmlformats.org/officeDocument/2006/math" xmlns:v="urn:schemas-microsoft-com:vml" xmlns:wp14="http://schemas.microsoft.com/office/word/2010/wordprocessingDrawing" xmlns:wp="http://schemas.openxmlformats.org/drawingml/2006/wordprocessingDrawing" xmlns:w10="urn:schemas-microsoft-com:office:word" xmlns:w="http://schemas.openxmlformats.org/wordprocessingml/2006/main" xmlns:w14="http://schemas.microsoft.com/office/word/2010/wordml" xmlns:w15="http://schemas.microsoft.com/office/word/2012/wordml" xmlns:w16cex="http://schemas.microsoft.com/office/word/2018/wordml/cex" xmlns:w16cid="http://schemas.microsoft.com/office/word/2016/wordml/cid" xmlns:w16="http://schemas.microsoft.com/office/word/2018/wordml" xmlns:w16du="http://schemas.microsoft.com/office/word/2023/wordml/word16du" xmlns:w16sdtdh="http://schemas.microsoft.com/office/word/2020/wordml/sdtdatahash" xmlns:w16sdtfl="http://schemas.microsoft.com/office/word/2024/wordml/sdtformatlock" xmlns:w16se="http://schemas.microsoft.com/office/word/2015/wordml/symex" xmlns:wpg="http://schemas.microsoft.com/office/word/2010/wordprocessingGroup" xmlns:wpi="http://schemas.microsoft.com/office/word/2010/wordprocessingInk" xmlns:wne="http://schemas.microsoft.com/office/word/2006/wordml" xmlns:wps="http://schemas.microsoft.com/office/word/2010/wordprocessingShape" mc:Ignorable="w14 w15 w16se w16cid w16 w16cex w16sdtdh w16sdtfl w16du wp14">
+<w:ftr xmlns:wpc="http://schemas.microsoft.com/office/word/2010/wordprocessingCanvas" xmlns:cx="http://schemas.microsoft.com/office/drawing/2014/chartex" xmlns:cx1="http://schemas.microsoft.com/office/drawing/2015/9/8/chartex" xmlns:cx2="http://schemas.microsoft.com/office/drawing/2015/10/21/chartex" xmlns:cx3="http://schemas.microsoft.com/office/drawing/2016/5/9/chartex" xmlns:cx4="http://schemas.microsoft.com/office/drawing/2016/5/10/chartex" xmlns:cx5="http://schemas.microsoft.com/office/drawing/2016/5/11/chartex" xmlns:cx6="http://schemas.microsoft.com/office/drawing/2016/5/12/chartex" xmlns:cx7="http://schemas.microsoft.com/office/drawing/2016/5/13/chartex" xmlns:cx8="http://schemas.microsoft.com/office/drawing/2016/5/14/chartex" xmlns:mc="http://schemas.openxmlformats.org/markup-compatibility/2006" xmlns:aink="http://schemas.microsoft.com/office/drawing/2016/ink" xmlns:am3d="http://schemas.microsoft.com/office/drawing/2017/model3d" xmlns:o="urn:schemas-microsoft-com:office:office" xmlns:oel="http://schemas.microsoft.com/office/2019/extlst" xmlns:r="http://schemas.openxmlformats.org/officeDocument/2006/relationships" xmlns:m="http://schemas.openxmlformats.org/officeDocument/2006/math" xmlns:v="urn:schemas-microsoft-com:vml" xmlns:wp14="http://schemas.microsoft.com/office/word/2010/wordprocessingDrawing" xmlns:wp="http://schemas.openxmlformats.org/drawingml/2006/wordprocessingDrawing" xmlns:w10="urn:schemas-microsoft-com:office:word" xmlns:w="http://schemas.openxmlformats.org/wordprocessingml/2006/main" xmlns:w14="http://schemas.microsoft.com/office/word/2010/wordml" xmlns:w15="http://schemas.microsoft.com/office/word/2012/wordml" xmlns:w16cei="http://schemas.microsoft.com/office/word/2026/wordml/cei" xmlns:w16cex="http://schemas.microsoft.com/office/word/2018/wordml/cex" xmlns:w16cid="http://schemas.microsoft.com/office/word/2016/wordml/cid" xmlns:w16="http://schemas.microsoft.com/office/word/2018/wordml" xmlns:w16du="http://schemas.microsoft.com/office/word/2023/wordml/word16du" xmlns:w16sdtdh="http://schemas.microsoft.com/office/word/2020/wordml/sdtdatahash" xmlns:w16sdtfl="http://schemas.microsoft.com/office/word/2024/wordml/sdtformatlock" xmlns:w16se="http://schemas.microsoft.com/office/word/2015/wordml/symex" xmlns:wpg="http://schemas.microsoft.com/office/word/2010/wordprocessingGroup" xmlns:wpi="http://schemas.microsoft.com/office/word/2010/wordprocessingInk" xmlns:wne="http://schemas.microsoft.com/office/word/2006/wordml" xmlns:wps="http://schemas.microsoft.com/office/word/2010/wordprocessingShape" mc:Ignorable="w14 w15 w16se w16cid w16 w16cex w16sdtdh w16sdtfl w16du wp14">
   <w:sdt>
     <w:sdtPr>
       <w:rPr>
@@ -3580,7 +3659,7 @@
 </file>
 
 <file path=word/footer2.xml><?xml version="1.0" encoding="utf-8"?>
-<w:ftr xmlns:wpc="http://schemas.microsoft.com/office/word/2010/wordprocessingCanvas" xmlns:cx="http://schemas.microsoft.com/office/drawing/2014/chartex" xmlns:cx1="http://schemas.microsoft.com/office/drawing/2015/9/8/chartex" xmlns:cx2="http://schemas.microsoft.com/office/drawing/2015/10/21/chartex" xmlns:cx3="http://schemas.microsoft.com/office/drawing/2016/5/9/chartex" xmlns:cx4="http://schemas.microsoft.com/office/drawing/2016/5/10/chartex" xmlns:cx5="http://schemas.microsoft.com/office/drawing/2016/5/11/chartex" xmlns:cx6="http://schemas.microsoft.com/office/drawing/2016/5/12/chartex" xmlns:cx7="http://schemas.microsoft.com/office/drawing/2016/5/13/chartex" xmlns:cx8="http://schemas.microsoft.com/office/drawing/2016/5/14/chartex" xmlns:mc="http://schemas.openxmlformats.org/markup-compatibility/2006" xmlns:aink="http://schemas.microsoft.com/office/drawing/2016/ink" xmlns:am3d="http://schemas.microsoft.com/office/drawing/2017/model3d" xmlns:o="urn:schemas-microsoft-com:office:office" xmlns:oel="http://schemas.microsoft.com/office/2019/extlst" xmlns:r="http://schemas.openxmlformats.org/officeDocument/2006/relationships" xmlns:m="http://schemas.openxmlformats.org/officeDocument/2006/math" xmlns:v="urn:schemas-microsoft-com:vml" xmlns:wp14="http://schemas.microsoft.com/office/word/2010/wordprocessingDrawing" xmlns:wp="http://schemas.openxmlformats.org/drawingml/2006/wordprocessingDrawing" xmlns:w10="urn:schemas-microsoft-com:office:word" xmlns:w="http://schemas.openxmlformats.org/wordprocessingml/2006/main" xmlns:w14="http://schemas.microsoft.com/office/word/2010/wordml" xmlns:w15="http://schemas.microsoft.com/office/word/2012/wordml" xmlns:w16cex="http://schemas.microsoft.com/office/word/2018/wordml/cex" xmlns:w16cid="http://schemas.microsoft.com/office/word/2016/wordml/cid" xmlns:w16="http://schemas.microsoft.com/office/word/2018/wordml" xmlns:w16du="http://schemas.microsoft.com/office/word/2023/wordml/word16du" xmlns:w16sdtdh="http://schemas.microsoft.com/office/word/2020/wordml/sdtdatahash" xmlns:w16sdtfl="http://schemas.microsoft.com/office/word/2024/wordml/sdtformatlock" xmlns:w16se="http://schemas.microsoft.com/office/word/2015/wordml/symex" xmlns:wpg="http://schemas.microsoft.com/office/word/2010/wordprocessingGroup" xmlns:wpi="http://schemas.microsoft.com/office/word/2010/wordprocessingInk" xmlns:wne="http://schemas.microsoft.com/office/word/2006/wordml" xmlns:wps="http://schemas.microsoft.com/office/word/2010/wordprocessingShape" mc:Ignorable="w14 w15 w16se w16cid w16 w16cex w16sdtdh w16sdtfl w16du wp14">
+<w:ftr xmlns:wpc="http://schemas.microsoft.com/office/word/2010/wordprocessingCanvas" xmlns:cx="http://schemas.microsoft.com/office/drawing/2014/chartex" xmlns:cx1="http://schemas.microsoft.com/office/drawing/2015/9/8/chartex" xmlns:cx2="http://schemas.microsoft.com/office/drawing/2015/10/21/chartex" xmlns:cx3="http://schemas.microsoft.com/office/drawing/2016/5/9/chartex" xmlns:cx4="http://schemas.microsoft.com/office/drawing/2016/5/10/chartex" xmlns:cx5="http://schemas.microsoft.com/office/drawing/2016/5/11/chartex" xmlns:cx6="http://schemas.microsoft.com/office/drawing/2016/5/12/chartex" xmlns:cx7="http://schemas.microsoft.com/office/drawing/2016/5/13/chartex" xmlns:cx8="http://schemas.microsoft.com/office/drawing/2016/5/14/chartex" xmlns:mc="http://schemas.openxmlformats.org/markup-compatibility/2006" xmlns:aink="http://schemas.microsoft.com/office/drawing/2016/ink" xmlns:am3d="http://schemas.microsoft.com/office/drawing/2017/model3d" xmlns:o="urn:schemas-microsoft-com:office:office" xmlns:oel="http://schemas.microsoft.com/office/2019/extlst" xmlns:r="http://schemas.openxmlformats.org/officeDocument/2006/relationships" xmlns:m="http://schemas.openxmlformats.org/officeDocument/2006/math" xmlns:v="urn:schemas-microsoft-com:vml" xmlns:wp14="http://schemas.microsoft.com/office/word/2010/wordprocessingDrawing" xmlns:wp="http://schemas.openxmlformats.org/drawingml/2006/wordprocessingDrawing" xmlns:w10="urn:schemas-microsoft-com:office:word" xmlns:w="http://schemas.openxmlformats.org/wordprocessingml/2006/main" xmlns:w14="http://schemas.microsoft.com/office/word/2010/wordml" xmlns:w15="http://schemas.microsoft.com/office/word/2012/wordml" xmlns:w16cei="http://schemas.microsoft.com/office/word/2026/wordml/cei" xmlns:w16cex="http://schemas.microsoft.com/office/word/2018/wordml/cex" xmlns:w16cid="http://schemas.microsoft.com/office/word/2016/wordml/cid" xmlns:w16="http://schemas.microsoft.com/office/word/2018/wordml" xmlns:w16du="http://schemas.microsoft.com/office/word/2023/wordml/word16du" xmlns:w16sdtdh="http://schemas.microsoft.com/office/word/2020/wordml/sdtdatahash" xmlns:w16sdtfl="http://schemas.microsoft.com/office/word/2024/wordml/sdtformatlock" xmlns:w16se="http://schemas.microsoft.com/office/word/2015/wordml/symex" xmlns:wpg="http://schemas.microsoft.com/office/word/2010/wordprocessingGroup" xmlns:wpi="http://schemas.microsoft.com/office/word/2010/wordprocessingInk" xmlns:wne="http://schemas.microsoft.com/office/word/2006/wordml" xmlns:wps="http://schemas.microsoft.com/office/word/2010/wordprocessingShape" mc:Ignorable="w14 w15 w16se w16cid w16 w16cex w16sdtdh w16sdtfl w16du wp14">
   <w:sdt>
     <w:sdtPr>
       <w:rPr>
@@ -3723,7 +3802,7 @@
 </file>
 
 <file path=word/footnotes.xml><?xml version="1.0" encoding="utf-8"?>
-<w:footnotes xmlns:wpc="http://schemas.microsoft.com/office/word/2010/wordprocessingCanvas" xmlns:cx="http://schemas.microsoft.com/office/drawing/2014/chartex" xmlns:cx1="http://schemas.microsoft.com/office/drawing/2015/9/8/chartex" xmlns:cx2="http://schemas.microsoft.com/office/drawing/2015/10/21/chartex" xmlns:cx3="http://schemas.microsoft.com/office/drawing/2016/5/9/chartex" xmlns:cx4="http://schemas.microsoft.com/office/drawing/2016/5/10/chartex" xmlns:cx5="http://schemas.microsoft.com/office/drawing/2016/5/11/chartex" xmlns:cx6="http://schemas.microsoft.com/office/drawing/2016/5/12/chartex" xmlns:cx7="http://schemas.microsoft.com/office/drawing/2016/5/13/chartex" xmlns:cx8="http://schemas.microsoft.com/office/drawing/2016/5/14/chartex" xmlns:mc="http://schemas.openxmlformats.org/markup-compatibility/2006" xmlns:aink="http://schemas.microsoft.com/office/drawing/2016/ink" xmlns:am3d="http://schemas.microsoft.com/office/drawing/2017/model3d" xmlns:o="urn:schemas-microsoft-com:office:office" xmlns:oel="http://schemas.microsoft.com/office/2019/extlst" xmlns:r="http://schemas.openxmlformats.org/officeDocument/2006/relationships" xmlns:m="http://schemas.openxmlformats.org/officeDocument/2006/math" xmlns:v="urn:schemas-microsoft-com:vml" xmlns:wp14="http://schemas.microsoft.com/office/word/2010/wordprocessingDrawing" xmlns:wp="http://schemas.openxmlformats.org/drawingml/2006/wordprocessingDrawing" xmlns:w10="urn:schemas-microsoft-com:office:word" xmlns:w="http://schemas.openxmlformats.org/wordprocessingml/2006/main" xmlns:w14="http://schemas.microsoft.com/office/word/2010/wordml" xmlns:w15="http://schemas.microsoft.com/office/word/2012/wordml" xmlns:w16cex="http://schemas.microsoft.com/office/word/2018/wordml/cex" xmlns:w16cid="http://schemas.microsoft.com/office/word/2016/wordml/cid" xmlns:w16="http://schemas.microsoft.com/office/word/2018/wordml" xmlns:w16du="http://schemas.microsoft.com/office/word/2023/wordml/word16du" xmlns:w16sdtdh="http://schemas.microsoft.com/office/word/2020/wordml/sdtdatahash" xmlns:w16sdtfl="http://schemas.microsoft.com/office/word/2024/wordml/sdtformatlock" xmlns:w16se="http://schemas.microsoft.com/office/word/2015/wordml/symex" xmlns:wpg="http://schemas.microsoft.com/office/word/2010/wordprocessingGroup" xmlns:wpi="http://schemas.microsoft.com/office/word/2010/wordprocessingInk" xmlns:wne="http://schemas.microsoft.com/office/word/2006/wordml" xmlns:wps="http://schemas.microsoft.com/office/word/2010/wordprocessingShape" mc:Ignorable="w14 w15 w16se w16cid w16 w16cex w16sdtdh w16sdtfl w16du wp14">
+<w:footnotes xmlns:wpc="http://schemas.microsoft.com/office/word/2010/wordprocessingCanvas" xmlns:cx="http://schemas.microsoft.com/office/drawing/2014/chartex" xmlns:cx1="http://schemas.microsoft.com/office/drawing/2015/9/8/chartex" xmlns:cx2="http://schemas.microsoft.com/office/drawing/2015/10/21/chartex" xmlns:cx3="http://schemas.microsoft.com/office/drawing/2016/5/9/chartex" xmlns:cx4="http://schemas.microsoft.com/office/drawing/2016/5/10/chartex" xmlns:cx5="http://schemas.microsoft.com/office/drawing/2016/5/11/chartex" xmlns:cx6="http://schemas.microsoft.com/office/drawing/2016/5/12/chartex" xmlns:cx7="http://schemas.microsoft.com/office/drawing/2016/5/13/chartex" xmlns:cx8="http://schemas.microsoft.com/office/drawing/2016/5/14/chartex" xmlns:mc="http://schemas.openxmlformats.org/markup-compatibility/2006" xmlns:aink="http://schemas.microsoft.com/office/drawing/2016/ink" xmlns:am3d="http://schemas.microsoft.com/office/drawing/2017/model3d" xmlns:o="urn:schemas-microsoft-com:office:office" xmlns:oel="http://schemas.microsoft.com/office/2019/extlst" xmlns:r="http://schemas.openxmlformats.org/officeDocument/2006/relationships" xmlns:m="http://schemas.openxmlformats.org/officeDocument/2006/math" xmlns:v="urn:schemas-microsoft-com:vml" xmlns:wp14="http://schemas.microsoft.com/office/word/2010/wordprocessingDrawing" xmlns:wp="http://schemas.openxmlformats.org/drawingml/2006/wordprocessingDrawing" xmlns:w10="urn:schemas-microsoft-com:office:word" xmlns:w="http://schemas.openxmlformats.org/wordprocessingml/2006/main" xmlns:w14="http://schemas.microsoft.com/office/word/2010/wordml" xmlns:w15="http://schemas.microsoft.com/office/word/2012/wordml" xmlns:w16cei="http://schemas.microsoft.com/office/word/2026/wordml/cei" xmlns:w16cex="http://schemas.microsoft.com/office/word/2018/wordml/cex" xmlns:w16cid="http://schemas.microsoft.com/office/word/2016/wordml/cid" xmlns:w16="http://schemas.microsoft.com/office/word/2018/wordml" xmlns:w16du="http://schemas.microsoft.com/office/word/2023/wordml/word16du" xmlns:w16sdtdh="http://schemas.microsoft.com/office/word/2020/wordml/sdtdatahash" xmlns:w16sdtfl="http://schemas.microsoft.com/office/word/2024/wordml/sdtformatlock" xmlns:w16se="http://schemas.microsoft.com/office/word/2015/wordml/symex" xmlns:wpg="http://schemas.microsoft.com/office/word/2010/wordprocessingGroup" xmlns:wpi="http://schemas.microsoft.com/office/word/2010/wordprocessingInk" xmlns:wne="http://schemas.microsoft.com/office/word/2006/wordml" xmlns:wps="http://schemas.microsoft.com/office/word/2010/wordprocessingShape" mc:Ignorable="w14 w15 w16se w16cid w16 w16cex w16sdtdh w16sdtfl w16du wp14">
   <w:footnote w:type="separator" w:id="-1">
     <w:p>
       <w:pPr>
@@ -3755,7 +3834,7 @@
 </file>
 
 <file path=word/header1.xml><?xml version="1.0" encoding="utf-8"?>
-<w:hdr xmlns:wpc="http://schemas.microsoft.com/office/word/2010/wordprocessingCanvas" xmlns:cx="http://schemas.microsoft.com/office/drawing/2014/chartex" xmlns:cx1="http://schemas.microsoft.com/office/drawing/2015/9/8/chartex" xmlns:cx2="http://schemas.microsoft.com/office/drawing/2015/10/21/chartex" xmlns:cx3="http://schemas.microsoft.com/office/drawing/2016/5/9/chartex" xmlns:cx4="http://schemas.microsoft.com/office/drawing/2016/5/10/chartex" xmlns:cx5="http://schemas.microsoft.com/office/drawing/2016/5/11/chartex" xmlns:cx6="http://schemas.microsoft.com/office/drawing/2016/5/12/chartex" xmlns:cx7="http://schemas.microsoft.com/office/drawing/2016/5/13/chartex" xmlns:cx8="http://schemas.microsoft.com/office/drawing/2016/5/14/chartex" xmlns:mc="http://schemas.openxmlformats.org/markup-compatibility/2006" xmlns:aink="http://schemas.microsoft.com/office/drawing/2016/ink" xmlns:am3d="http://schemas.microsoft.com/office/drawing/2017/model3d" xmlns:o="urn:schemas-microsoft-com:office:office" xmlns:oel="http://schemas.microsoft.com/office/2019/extlst" xmlns:r="http://schemas.openxmlformats.org/officeDocument/2006/relationships" xmlns:m="http://schemas.openxmlformats.org/officeDocument/2006/math" xmlns:v="urn:schemas-microsoft-com:vml" xmlns:wp14="http://schemas.microsoft.com/office/word/2010/wordprocessingDrawing" xmlns:wp="http://schemas.openxmlformats.org/drawingml/2006/wordprocessingDrawing" xmlns:w10="urn:schemas-microsoft-com:office:word" xmlns:w="http://schemas.openxmlformats.org/wordprocessingml/2006/main" xmlns:w14="http://schemas.microsoft.com/office/word/2010/wordml" xmlns:w15="http://schemas.microsoft.com/office/word/2012/wordml" xmlns:w16cex="http://schemas.microsoft.com/office/word/2018/wordml/cex" xmlns:w16cid="http://schemas.microsoft.com/office/word/2016/wordml/cid" xmlns:w16="http://schemas.microsoft.com/office/word/2018/wordml" xmlns:w16du="http://schemas.microsoft.com/office/word/2023/wordml/word16du" xmlns:w16sdtdh="http://schemas.microsoft.com/office/word/2020/wordml/sdtdatahash" xmlns:w16sdtfl="http://schemas.microsoft.com/office/word/2024/wordml/sdtformatlock" xmlns:w16se="http://schemas.microsoft.com/office/word/2015/wordml/symex" xmlns:wpg="http://schemas.microsoft.com/office/word/2010/wordprocessingGroup" xmlns:wpi="http://schemas.microsoft.com/office/word/2010/wordprocessingInk" xmlns:wne="http://schemas.microsoft.com/office/word/2006/wordml" xmlns:wps="http://schemas.microsoft.com/office/word/2010/wordprocessingShape" mc:Ignorable="w14 w15 w16se w16cid w16 w16cex w16sdtdh w16sdtfl w16du wp14">
+<w:hdr xmlns:wpc="http://schemas.microsoft.com/office/word/2010/wordprocessingCanvas" xmlns:cx="http://schemas.microsoft.com/office/drawing/2014/chartex" xmlns:cx1="http://schemas.microsoft.com/office/drawing/2015/9/8/chartex" xmlns:cx2="http://schemas.microsoft.com/office/drawing/2015/10/21/chartex" xmlns:cx3="http://schemas.microsoft.com/office/drawing/2016/5/9/chartex" xmlns:cx4="http://schemas.microsoft.com/office/drawing/2016/5/10/chartex" xmlns:cx5="http://schemas.microsoft.com/office/drawing/2016/5/11/chartex" xmlns:cx6="http://schemas.microsoft.com/office/drawing/2016/5/12/chartex" xmlns:cx7="http://schemas.microsoft.com/office/drawing/2016/5/13/chartex" xmlns:cx8="http://schemas.microsoft.com/office/drawing/2016/5/14/chartex" xmlns:mc="http://schemas.openxmlformats.org/markup-compatibility/2006" xmlns:aink="http://schemas.microsoft.com/office/drawing/2016/ink" xmlns:am3d="http://schemas.microsoft.com/office/drawing/2017/model3d" xmlns:o="urn:schemas-microsoft-com:office:office" xmlns:oel="http://schemas.microsoft.com/office/2019/extlst" xmlns:r="http://schemas.openxmlformats.org/officeDocument/2006/relationships" xmlns:m="http://schemas.openxmlformats.org/officeDocument/2006/math" xmlns:v="urn:schemas-microsoft-com:vml" xmlns:wp14="http://schemas.microsoft.com/office/word/2010/wordprocessingDrawing" xmlns:wp="http://schemas.openxmlformats.org/drawingml/2006/wordprocessingDrawing" xmlns:w10="urn:schemas-microsoft-com:office:word" xmlns:w="http://schemas.openxmlformats.org/wordprocessingml/2006/main" xmlns:w14="http://schemas.microsoft.com/office/word/2010/wordml" xmlns:w15="http://schemas.microsoft.com/office/word/2012/wordml" xmlns:w16cei="http://schemas.microsoft.com/office/word/2026/wordml/cei" xmlns:w16cex="http://schemas.microsoft.com/office/word/2018/wordml/cex" xmlns:w16cid="http://schemas.microsoft.com/office/word/2016/wordml/cid" xmlns:w16="http://schemas.microsoft.com/office/word/2018/wordml" xmlns:w16du="http://schemas.microsoft.com/office/word/2023/wordml/word16du" xmlns:w16sdtdh="http://schemas.microsoft.com/office/word/2020/wordml/sdtdatahash" xmlns:w16sdtfl="http://schemas.microsoft.com/office/word/2024/wordml/sdtformatlock" xmlns:w16se="http://schemas.microsoft.com/office/word/2015/wordml/symex" xmlns:wpg="http://schemas.microsoft.com/office/word/2010/wordprocessingGroup" xmlns:wpi="http://schemas.microsoft.com/office/word/2010/wordprocessingInk" xmlns:wne="http://schemas.microsoft.com/office/word/2006/wordml" xmlns:wps="http://schemas.microsoft.com/office/word/2010/wordprocessingShape" mc:Ignorable="w14 w15 w16se w16cid w16 w16cex w16sdtdh w16sdtfl w16du wp14">
   <w:p>
     <w:pPr>
       <w:pStyle w:val="Encabezado"/>
@@ -3780,7 +3859,7 @@
 </file>
 
 <file path=word/header2.xml><?xml version="1.0" encoding="utf-8"?>
-<w:hdr xmlns:wpc="http://schemas.microsoft.com/office/word/2010/wordprocessingCanvas" xmlns:cx="http://schemas.microsoft.com/office/drawing/2014/chartex" xmlns:cx1="http://schemas.microsoft.com/office/drawing/2015/9/8/chartex" xmlns:cx2="http://schemas.microsoft.com/office/drawing/2015/10/21/chartex" xmlns:cx3="http://schemas.microsoft.com/office/drawing/2016/5/9/chartex" xmlns:cx4="http://schemas.microsoft.com/office/drawing/2016/5/10/chartex" xmlns:cx5="http://schemas.microsoft.com/office/drawing/2016/5/11/chartex" xmlns:cx6="http://schemas.microsoft.com/office/drawing/2016/5/12/chartex" xmlns:cx7="http://schemas.microsoft.com/office/drawing/2016/5/13/chartex" xmlns:cx8="http://schemas.microsoft.com/office/drawing/2016/5/14/chartex" xmlns:mc="http://schemas.openxmlformats.org/markup-compatibility/2006" xmlns:aink="http://schemas.microsoft.com/office/drawing/2016/ink" xmlns:am3d="http://schemas.microsoft.com/office/drawing/2017/model3d" xmlns:o="urn:schemas-microsoft-com:office:office" xmlns:oel="http://schemas.microsoft.com/office/2019/extlst" xmlns:r="http://schemas.openxmlformats.org/officeDocument/2006/relationships" xmlns:m="http://schemas.openxmlformats.org/officeDocument/2006/math" xmlns:v="urn:schemas-microsoft-com:vml" xmlns:wp14="http://schemas.microsoft.com/office/word/2010/wordprocessingDrawing" xmlns:wp="http://schemas.openxmlformats.org/drawingml/2006/wordprocessingDrawing" xmlns:w10="urn:schemas-microsoft-com:office:word" xmlns:w="http://schemas.openxmlformats.org/wordprocessingml/2006/main" xmlns:w14="http://schemas.microsoft.com/office/word/2010/wordml" xmlns:w15="http://schemas.microsoft.com/office/word/2012/wordml" xmlns:w16cex="http://schemas.microsoft.com/office/word/2018/wordml/cex" xmlns:w16cid="http://schemas.microsoft.com/office/word/2016/wordml/cid" xmlns:w16="http://schemas.microsoft.com/office/word/2018/wordml" xmlns:w16du="http://schemas.microsoft.com/office/word/2023/wordml/word16du" xmlns:w16sdtdh="http://schemas.microsoft.com/office/word/2020/wordml/sdtdatahash" xmlns:w16sdtfl="http://schemas.microsoft.com/office/word/2024/wordml/sdtformatlock" xmlns:w16se="http://schemas.microsoft.com/office/word/2015/wordml/symex" xmlns:wpg="http://schemas.microsoft.com/office/word/2010/wordprocessingGroup" xmlns:wpi="http://schemas.microsoft.com/office/word/2010/wordprocessingInk" xmlns:wne="http://schemas.microsoft.com/office/word/2006/wordml" xmlns:wps="http://schemas.microsoft.com/office/word/2010/wordprocessingShape" mc:Ignorable="w14 w15 w16se w16cid w16 w16cex w16sdtdh w16sdtfl w16du wp14">
+<w:hdr xmlns:wpc="http://schemas.microsoft.com/office/word/2010/wordprocessingCanvas" xmlns:cx="http://schemas.microsoft.com/office/drawing/2014/chartex" xmlns:cx1="http://schemas.microsoft.com/office/drawing/2015/9/8/chartex" xmlns:cx2="http://schemas.microsoft.com/office/drawing/2015/10/21/chartex" xmlns:cx3="http://schemas.microsoft.com/office/drawing/2016/5/9/chartex" xmlns:cx4="http://schemas.microsoft.com/office/drawing/2016/5/10/chartex" xmlns:cx5="http://schemas.microsoft.com/office/drawing/2016/5/11/chartex" xmlns:cx6="http://schemas.microsoft.com/office/drawing/2016/5/12/chartex" xmlns:cx7="http://schemas.microsoft.com/office/drawing/2016/5/13/chartex" xmlns:cx8="http://schemas.microsoft.com/office/drawing/2016/5/14/chartex" xmlns:mc="http://schemas.openxmlformats.org/markup-compatibility/2006" xmlns:aink="http://schemas.microsoft.com/office/drawing/2016/ink" xmlns:am3d="http://schemas.microsoft.com/office/drawing/2017/model3d" xmlns:o="urn:schemas-microsoft-com:office:office" xmlns:oel="http://schemas.microsoft.com/office/2019/extlst" xmlns:r="http://schemas.openxmlformats.org/officeDocument/2006/relationships" xmlns:m="http://schemas.openxmlformats.org/officeDocument/2006/math" xmlns:v="urn:schemas-microsoft-com:vml" xmlns:wp14="http://schemas.microsoft.com/office/word/2010/wordprocessingDrawing" xmlns:wp="http://schemas.openxmlformats.org/drawingml/2006/wordprocessingDrawing" xmlns:w10="urn:schemas-microsoft-com:office:word" xmlns:w="http://schemas.openxmlformats.org/wordprocessingml/2006/main" xmlns:w14="http://schemas.microsoft.com/office/word/2010/wordml" xmlns:w15="http://schemas.microsoft.com/office/word/2012/wordml" xmlns:w16cei="http://schemas.microsoft.com/office/word/2026/wordml/cei" xmlns:w16cex="http://schemas.microsoft.com/office/word/2018/wordml/cex" xmlns:w16cid="http://schemas.microsoft.com/office/word/2016/wordml/cid" xmlns:w16="http://schemas.microsoft.com/office/word/2018/wordml" xmlns:w16du="http://schemas.microsoft.com/office/word/2023/wordml/word16du" xmlns:w16sdtdh="http://schemas.microsoft.com/office/word/2020/wordml/sdtdatahash" xmlns:w16sdtfl="http://schemas.microsoft.com/office/word/2024/wordml/sdtformatlock" xmlns:w16se="http://schemas.microsoft.com/office/word/2015/wordml/symex" xmlns:wpg="http://schemas.microsoft.com/office/word/2010/wordprocessingGroup" xmlns:wpi="http://schemas.microsoft.com/office/word/2010/wordprocessingInk" xmlns:wne="http://schemas.microsoft.com/office/word/2006/wordml" xmlns:wps="http://schemas.microsoft.com/office/word/2010/wordprocessingShape" mc:Ignorable="w14 w15 w16se w16cid w16 w16cex w16sdtdh w16sdtfl w16du wp14">
   <w:tbl>
     <w:tblPr>
       <w:tblW w:w="8505" w:type="dxa"/>
@@ -4018,7 +4097,7 @@
 </file>
 
 <file path=word/numbering.xml><?xml version="1.0" encoding="utf-8"?>
-<w:numbering xmlns:wpc="http://schemas.microsoft.com/office/word/2010/wordprocessingCanvas" xmlns:cx="http://schemas.microsoft.com/office/drawing/2014/chartex" xmlns:cx1="http://schemas.microsoft.com/office/drawing/2015/9/8/chartex" xmlns:cx2="http://schemas.microsoft.com/office/drawing/2015/10/21/chartex" xmlns:cx3="http://schemas.microsoft.com/office/drawing/2016/5/9/chartex" xmlns:cx4="http://schemas.microsoft.com/office/drawing/2016/5/10/chartex" xmlns:cx5="http://schemas.microsoft.com/office/drawing/2016/5/11/chartex" xmlns:cx6="http://schemas.microsoft.com/office/drawing/2016/5/12/chartex" xmlns:cx7="http://schemas.microsoft.com/office/drawing/2016/5/13/chartex" xmlns:cx8="http://schemas.microsoft.com/office/drawing/2016/5/14/chartex" xmlns:mc="http://schemas.openxmlformats.org/markup-compatibility/2006" xmlns:aink="http://schemas.microsoft.com/office/drawing/2016/ink" xmlns:am3d="http://schemas.microsoft.com/office/drawing/2017/model3d" xmlns:o="urn:schemas-microsoft-com:office:office" xmlns:oel="http://schemas.microsoft.com/office/2019/extlst" xmlns:r="http://schemas.openxmlformats.org/officeDocument/2006/relationships" xmlns:m="http://schemas.openxmlformats.org/officeDocument/2006/math" xmlns:v="urn:schemas-microsoft-com:vml" xmlns:wp14="http://schemas.microsoft.com/office/word/2010/wordprocessingDrawing" xmlns:wp="http://schemas.openxmlformats.org/drawingml/2006/wordprocessingDrawing" xmlns:w10="urn:schemas-microsoft-com:office:word" xmlns:w="http://schemas.openxmlformats.org/wordprocessingml/2006/main" xmlns:w14="http://schemas.microsoft.com/office/word/2010/wordml" xmlns:w15="http://schemas.microsoft.com/office/word/2012/wordml" xmlns:w16cex="http://schemas.microsoft.com/office/word/2018/wordml/cex" xmlns:w16cid="http://schemas.microsoft.com/office/word/2016/wordml/cid" xmlns:w16="http://schemas.microsoft.com/office/word/2018/wordml" xmlns:w16du="http://schemas.microsoft.com/office/word/2023/wordml/word16du" xmlns:w16sdtdh="http://schemas.microsoft.com/office/word/2020/wordml/sdtdatahash" xmlns:w16sdtfl="http://schemas.microsoft.com/office/word/2024/wordml/sdtformatlock" xmlns:w16se="http://schemas.microsoft.com/office/word/2015/wordml/symex" xmlns:wpg="http://schemas.microsoft.com/office/word/2010/wordprocessingGroup" xmlns:wpi="http://schemas.microsoft.com/office/word/2010/wordprocessingInk" xmlns:wne="http://schemas.microsoft.com/office/word/2006/wordml" xmlns:wps="http://schemas.microsoft.com/office/word/2010/wordprocessingShape" mc:Ignorable="w14 w15 w16se w16cid w16 w16cex w16sdtdh w16sdtfl w16du wp14">
+<w:numbering xmlns:wpc="http://schemas.microsoft.com/office/word/2010/wordprocessingCanvas" xmlns:cx="http://schemas.microsoft.com/office/drawing/2014/chartex" xmlns:cx1="http://schemas.microsoft.com/office/drawing/2015/9/8/chartex" xmlns:cx2="http://schemas.microsoft.com/office/drawing/2015/10/21/chartex" xmlns:cx3="http://schemas.microsoft.com/office/drawing/2016/5/9/chartex" xmlns:cx4="http://schemas.microsoft.com/office/drawing/2016/5/10/chartex" xmlns:cx5="http://schemas.microsoft.com/office/drawing/2016/5/11/chartex" xmlns:cx6="http://schemas.microsoft.com/office/drawing/2016/5/12/chartex" xmlns:cx7="http://schemas.microsoft.com/office/drawing/2016/5/13/chartex" xmlns:cx8="http://schemas.microsoft.com/office/drawing/2016/5/14/chartex" xmlns:mc="http://schemas.openxmlformats.org/markup-compatibility/2006" xmlns:aink="http://schemas.microsoft.com/office/drawing/2016/ink" xmlns:am3d="http://schemas.microsoft.com/office/drawing/2017/model3d" xmlns:o="urn:schemas-microsoft-com:office:office" xmlns:oel="http://schemas.microsoft.com/office/2019/extlst" xmlns:r="http://schemas.openxmlformats.org/officeDocument/2006/relationships" xmlns:m="http://schemas.openxmlformats.org/officeDocument/2006/math" xmlns:v="urn:schemas-microsoft-com:vml" xmlns:wp14="http://schemas.microsoft.com/office/word/2010/wordprocessingDrawing" xmlns:wp="http://schemas.openxmlformats.org/drawingml/2006/wordprocessingDrawing" xmlns:w10="urn:schemas-microsoft-com:office:word" xmlns:w="http://schemas.openxmlformats.org/wordprocessingml/2006/main" xmlns:w14="http://schemas.microsoft.com/office/word/2010/wordml" xmlns:w15="http://schemas.microsoft.com/office/word/2012/wordml" xmlns:w16cei="http://schemas.microsoft.com/office/word/2026/wordml/cei" xmlns:w16cex="http://schemas.microsoft.com/office/word/2018/wordml/cex" xmlns:w16cid="http://schemas.microsoft.com/office/word/2016/wordml/cid" xmlns:w16="http://schemas.microsoft.com/office/word/2018/wordml" xmlns:w16du="http://schemas.microsoft.com/office/word/2023/wordml/word16du" xmlns:w16sdtdh="http://schemas.microsoft.com/office/word/2020/wordml/sdtdatahash" xmlns:w16sdtfl="http://schemas.microsoft.com/office/word/2024/wordml/sdtformatlock" xmlns:w16se="http://schemas.microsoft.com/office/word/2015/wordml/symex" xmlns:wpg="http://schemas.microsoft.com/office/word/2010/wordprocessingGroup" xmlns:wpi="http://schemas.microsoft.com/office/word/2010/wordprocessingInk" xmlns:wne="http://schemas.microsoft.com/office/word/2006/wordml" xmlns:wps="http://schemas.microsoft.com/office/word/2010/wordprocessingShape" mc:Ignorable="w14 w15 w16se w16cid w16 w16cex w16sdtdh w16sdtfl w16du wp14">
   <w:abstractNum w:abstractNumId="0" w15:restartNumberingAfterBreak="0">
     <w:nsid w:val="113B332B"/>
     <w:multiLevelType w:val="hybridMultilevel"/>
@@ -4967,7 +5046,6 @@
   <w:style w:type="character" w:default="1" w:styleId="Fuentedeprrafopredeter">
     <w:name w:val="Default Paragraph Font"/>
     <w:uiPriority w:val="1"/>
-    <w:semiHidden/>
     <w:unhideWhenUsed/>
   </w:style>
   <w:style w:type="table" w:default="1" w:styleId="Tablanormal">
@@ -5482,6 +5560,10 @@
 </file>
 
 <file path=customXml/item1.xml><?xml version="1.0" encoding="utf-8"?>
+<b:Sources xmlns:b="http://schemas.openxmlformats.org/officeDocument/2006/bibliography" xmlns="http://schemas.openxmlformats.org/officeDocument/2006/bibliography" SelectedStyle="\APASixthEditionOfficeOnline.xsl" StyleName="APA" Version="6"/>
+</file>
+
+<file path=customXml/item2.xml><?xml version="1.0" encoding="utf-8"?>
 <p:properties xmlns:p="http://schemas.microsoft.com/office/2006/metadata/properties" xmlns:xsi="http://www.w3.org/2001/XMLSchema-instance" xmlns:pc="http://schemas.microsoft.com/office/infopath/2007/PartnerControls">
   <documentManagement>
     <lcf76f155ced4ddcb4097134ff3c332f xmlns="0671de82-fb77-4741-a946-bbedde5d4f76">
@@ -5492,20 +5574,7 @@
 </p:properties>
 </file>
 
-<file path=customXml/item2.xml><?xml version="1.0" encoding="utf-8"?>
-<b:Sources xmlns:b="http://schemas.openxmlformats.org/officeDocument/2006/bibliography" xmlns="http://schemas.openxmlformats.org/officeDocument/2006/bibliography" SelectedStyle="\APASixthEditionOfficeOnline.xsl" StyleName="APA" Version="6"/>
-</file>
-
 <file path=customXml/item3.xml><?xml version="1.0" encoding="utf-8"?>
-<?mso-contentType ?>
-<FormTemplates xmlns="http://schemas.microsoft.com/sharepoint/v3/contenttype/forms">
-  <Display>DocumentLibraryForm</Display>
-  <Edit>DocumentLibraryForm</Edit>
-  <New>DocumentLibraryForm</New>
-</FormTemplates>
-</file>
-
-<file path=customXml/item4.xml><?xml version="1.0" encoding="utf-8"?>
 <ct:contentTypeSchema xmlns:ct="http://schemas.microsoft.com/office/2006/metadata/contentType" xmlns:ma="http://schemas.microsoft.com/office/2006/metadata/properties/metaAttributes" ct:_="" ma:_="" ma:contentTypeName="Documento" ma:contentTypeID="0x01010068C79E2D4FBF494D8565142F1B408D23" ma:contentTypeVersion="13" ma:contentTypeDescription="Crear nuevo documento." ma:contentTypeScope="" ma:versionID="033ef99cf88c0d3b788bf7a31a0475d4">
   <xsd:schema xmlns:xsd="http://www.w3.org/2001/XMLSchema" xmlns:xs="http://www.w3.org/2001/XMLSchema" xmlns:p="http://schemas.microsoft.com/office/2006/metadata/properties" xmlns:ns2="0671de82-fb77-4741-a946-bbedde5d4f76" xmlns:ns3="bfe36008-4467-4f6a-b17f-684c3d9d556d" targetNamespace="http://schemas.microsoft.com/office/2006/metadata/properties" ma:root="true" ma:fieldsID="67b2ee94343aeb2f8f0920204dca2d30" ns2:_="" ns3:_="">
     <xsd:import namespace="0671de82-fb77-4741-a946-bbedde5d4f76"/>
@@ -5712,7 +5781,24 @@
 </ct:contentTypeSchema>
 </file>
 
+<file path=customXml/item4.xml><?xml version="1.0" encoding="utf-8"?>
+<?mso-contentType ?>
+<FormTemplates xmlns="http://schemas.microsoft.com/sharepoint/v3/contenttype/forms">
+  <Display>DocumentLibraryForm</Display>
+  <Edit>DocumentLibraryForm</Edit>
+  <New>DocumentLibraryForm</New>
+</FormTemplates>
+</file>
+
 <file path=customXml/itemProps1.xml><?xml version="1.0" encoding="utf-8"?>
+<ds:datastoreItem xmlns:ds="http://schemas.openxmlformats.org/officeDocument/2006/customXml" ds:itemID="{EDDE749B-1ED2-4CFC-B407-B3EDC88F0351}">
+  <ds:schemaRefs>
+    <ds:schemaRef ds:uri="http://schemas.openxmlformats.org/officeDocument/2006/bibliography"/>
+  </ds:schemaRefs>
+</ds:datastoreItem>
+</file>
+
+<file path=customXml/itemProps2.xml><?xml version="1.0" encoding="utf-8"?>
 <ds:datastoreItem xmlns:ds="http://schemas.openxmlformats.org/officeDocument/2006/customXml" ds:itemID="{41AEA7D2-D02A-4A22-8DB0-806C047780AB}">
   <ds:schemaRefs>
     <ds:schemaRef ds:uri="http://schemas.microsoft.com/office/2006/metadata/properties"/>
@@ -5723,23 +5809,7 @@
 </ds:datastoreItem>
 </file>
 
-<file path=customXml/itemProps2.xml><?xml version="1.0" encoding="utf-8"?>
-<ds:datastoreItem xmlns:ds="http://schemas.openxmlformats.org/officeDocument/2006/customXml" ds:itemID="{EDDE749B-1ED2-4CFC-B407-B3EDC88F0351}">
-  <ds:schemaRefs>
-    <ds:schemaRef ds:uri="http://schemas.openxmlformats.org/officeDocument/2006/bibliography"/>
-  </ds:schemaRefs>
-</ds:datastoreItem>
-</file>
-
 <file path=customXml/itemProps3.xml><?xml version="1.0" encoding="utf-8"?>
-<ds:datastoreItem xmlns:ds="http://schemas.openxmlformats.org/officeDocument/2006/customXml" ds:itemID="{3F384A7A-5473-42CA-8DD9-691BEF5CE007}">
-  <ds:schemaRefs>
-    <ds:schemaRef ds:uri="http://schemas.microsoft.com/sharepoint/v3/contenttype/forms"/>
-  </ds:schemaRefs>
-</ds:datastoreItem>
-</file>
-
-<file path=customXml/itemProps4.xml><?xml version="1.0" encoding="utf-8"?>
 <ds:datastoreItem xmlns:ds="http://schemas.openxmlformats.org/officeDocument/2006/customXml" ds:itemID="{B4204128-4410-4A8B-ADA6-9DCFD22B6495}">
   <ds:schemaRefs>
     <ds:schemaRef ds:uri="http://schemas.microsoft.com/office/2006/metadata/contentType"/>
@@ -5756,4 +5826,12 @@
     <ds:schemaRef ds:uri="http://schemas.microsoft.com/internal/obd"/>
   </ds:schemaRefs>
 </ds:datastoreItem>
+</file>
+
+<file path=customXml/itemProps4.xml><?xml version="1.0" encoding="utf-8"?>
+<ds:datastoreItem xmlns:ds="http://schemas.openxmlformats.org/officeDocument/2006/customXml" ds:itemID="{3F384A7A-5473-42CA-8DD9-691BEF5CE007}">
+  <ds:schemaRefs>
+    <ds:schemaRef ds:uri="http://schemas.microsoft.com/sharepoint/v3/contenttype/forms"/>
+  </ds:schemaRefs>
+</ds:datastoreItem>
 </file>
</xml_diff>